<commit_message>
feat(admin): configuration du modele economique COACHING (preexistant)
Le modele coaching (missions) n'a jamais ete retire par les evolutions
Formation — commissions, ecran admin, codes promo et page parrainage
fonctionnent comme avant. Ses taux etaient en revanche CODES EN DUR :
ils deviennent configurables par le super-admin dans « Parametres » :

- Part reversee au coach (%) — historique 80, borne 50-95 ;
- Commission parrainage coaching (% de la part plateforme) — historique 10.

Implementation tolerante (SQL brut + cache 60 s) : AVANT la migration
scripts/migrate-eco-coaching.js, les valeurs historiques restent en
vigueur et la sauvegarde affiche un avertissement clair. Un changement de
taux ne vaut que pour les missions futures (aucun recalcul des commissions
enregistrees). Guide Super-Admin documente ; ecran Codes promo clarifie
(le meme code sert aussi aux reservations coaching, saisie manuelle).

Co-Authored-By: Claude Opus 4.8 (1M context) <noreply@anthropic.com>
</commit_message>
<xml_diff>
--- a/guides/Guide-Super-Admin-EduWeb.docx
+++ b/guides/Guide-Super-Admin-EduWeb.docx
@@ -1146,6 +1146,90 @@
           <w:szCs w:val="22"/>
         </w:rPr>
         <w:t xml:space="preserve">Le bouton « Lancer la purge maintenant » exécute le nettoyage immédiatement ; la date de la dernière purge est affichée.</w:t>
+      </w:r>
+    </w:p>
+    <w:p>
+      <w:pPr>
+        <w:pStyle w:val="Heading2"/>
+      </w:pPr>
+      <w:r>
+        <w:t xml:space="preserve">Modèle économique du coaching (missions)</w:t>
+      </w:r>
+    </w:p>
+    <w:p>
+      <w:pPr>
+        <w:spacing w:after="120"/>
+      </w:pPr>
+      <w:r>
+        <w:rPr>
+          <w:sz w:val="22"/>
+          <w:szCs w:val="22"/>
+        </w:rPr>
+        <w:t xml:space="preserve">Les deux taux du programme coaching historique — jusqu'ici fixes — se règlent désormais ici :</w:t>
+      </w:r>
+    </w:p>
+    <w:p>
+      <w:pPr>
+        <w:pStyle w:val="ListParagraph"/>
+        <w:numPr>
+          <w:ilvl w:val="0"/>
+          <w:numId w:val="2"/>
+        </w:numPr>
+        <w:spacing w:after="40"/>
+      </w:pPr>
+      <w:r>
+        <w:rPr>
+          <w:sz w:val="22"/>
+          <w:szCs w:val="22"/>
+        </w:rPr>
+        <w:t xml:space="preserve">Part reversée au coach (%) : 80 % par défaut (la plateforme conserve le reste). Bornée entre 50 et 95.</w:t>
+      </w:r>
+    </w:p>
+    <w:p>
+      <w:pPr>
+        <w:pStyle w:val="ListParagraph"/>
+        <w:numPr>
+          <w:ilvl w:val="0"/>
+          <w:numId w:val="2"/>
+        </w:numPr>
+        <w:spacing w:after="40"/>
+      </w:pPr>
+      <w:r>
+        <w:rPr>
+          <w:sz w:val="22"/>
+          <w:szCs w:val="22"/>
+        </w:rPr>
+        <w:t xml:space="preserve">Commission de parrainage coaching (%) : la part de la commission des parrains (parents, coachs, commerciaux) sur les missions de leurs filleuls, en % de la part plateforme — 10 % par défaut (soit 2 % de la mission avec une part coach à 80 %).</w:t>
+      </w:r>
+    </w:p>
+    <w:p>
+      <w:pPr>
+        <w:pBdr>
+          <w:top w:val="single" w:color="FDF3E6" w:sz="2" w:space="6"/>
+          <w:bottom w:val="single" w:color="FDF3E6" w:sz="2" w:space="6"/>
+          <w:left w:val="single" w:color="C9871C" w:sz="18" w:space="10"/>
+          <w:right w:val="single" w:color="FDF3E6" w:sz="2" w:space="6"/>
+        </w:pBdr>
+        <w:shd w:fill="FDF3E6" w:color="auto" w:val="clear"/>
+        <w:spacing w:after="140" w:before="80"/>
+      </w:pPr>
+      <w:r>
+        <w:rPr>
+          <w:b/>
+          <w:bCs/>
+          <w:color w:val="C9871C"/>
+          <w:sz w:val="21"/>
+          <w:szCs w:val="21"/>
+        </w:rPr>
+        <w:t xml:space="preserve">Attention — </w:t>
+      </w:r>
+      <w:r>
+        <w:rPr>
+          <w:color w:val="5A3D12"/>
+          <w:sz w:val="21"/>
+          <w:szCs w:val="21"/>
+        </w:rPr>
+        <w:t xml:space="preserve">Un changement de taux ne vaut que pour les MISSIONS FUTURES : les commissions déjà enregistrées ne sont jamais recalculées. Ne confondez pas avec le modèle de la Formation (réductions/rétrocessions des abonnements), qui se règle dans « Finance &amp; parrainage ».</w:t>
       </w:r>
     </w:p>
     <w:p>

</xml_diff>